<commit_message>
fix(relatorio): corrige cidade/universidade para Maceio - UNIMA
A capa e a folha de rosto referenciavam 'Centro Universitario de Maringa'
por erro de transcricao. A instituicao correta e o Centro Universitario
de Maceio (UNIMA). Quatro substituicoes aplicadas no gerador:
- Capa (cabecalho): MACEIO no lugar de MARINGA
- Capa (cidade)   : MACEIO no lugar de MARINGA
- Folha de rosto  : 'Centro Universitario de Maceio'
- Folha de rosto  : 'MACEIO' como cidade

DOCX e PDF regenerados a partir do script atualizado.
</commit_message>
<xml_diff>
--- a/docs/relatorio/Relatorio_Motor_RAG.docx
+++ b/docs/relatorio/Relatorio_Motor_RAG.docx
@@ -12,7 +12,7 @@
           <w:b/>
           <w:sz w:val="24"/>
         </w:rPr>
-        <w:t>CENTRO UNIVERSITÁRIO DE MARINGÁ — UNIMA</w:t>
+        <w:t>CENTRO UNIVERSITÁRIO DE MACEIÓ — UNIMA</w:t>
       </w:r>
     </w:p>
     <w:p>
@@ -101,7 +101,7 @@
           <w:b/>
           <w:sz w:val="24"/>
         </w:rPr>
-        <w:t>MARINGÁ</w:t>
+        <w:t>MACEIÓ</w:t>
       </w:r>
     </w:p>
     <w:p>
@@ -184,7 +184,7 @@
           <w:rFonts w:ascii="Times New Roman" w:hAnsi="Times New Roman"/>
           <w:sz w:val="20"/>
         </w:rPr>
-        <w:t>Trabalho apresentado como requisito parcial à conclusão da disciplina de Estrutura de Dados, do Curso de Engenharia de Software do Centro Universitário de Maringá — UNIMA.</w:t>
+        <w:t>Trabalho apresentado como requisito parcial à conclusão da disciplina de Estrutura de Dados, do Curso de Engenharia de Software do Centro Universitário de Maceió — UNIMA.</w:t>
       </w:r>
     </w:p>
     <w:p/>
@@ -207,7 +207,7 @@
           <w:b/>
           <w:sz w:val="24"/>
         </w:rPr>
-        <w:t>MARINGÁ</w:t>
+        <w:t>MACEIÓ</w:t>
       </w:r>
     </w:p>
     <w:p>

</xml_diff>

<commit_message>
fix(relatorio): corrige curso para Ciencia da Computacao
A capa e a folha de rosto referenciavam 'Curso de Engenharia de
Software' por erro de transcricao. O curso correto e 'Ciencia da
Computacao'. Duas substituicoes aplicadas no gerador:
- Capa: 'CURSO DE GRADUACAO EM CIENCIA DA COMPUTACAO'
- Folha de rosto (nota): 'Curso de Ciencia da Computacao'

DOCX e PDF regenerados.
</commit_message>
<xml_diff>
--- a/docs/relatorio/Relatorio_Motor_RAG.docx
+++ b/docs/relatorio/Relatorio_Motor_RAG.docx
@@ -25,7 +25,7 @@
           <w:b/>
           <w:sz w:val="24"/>
         </w:rPr>
-        <w:t>CURSO DE GRADUAÇÃO EM ENGENHARIA DE SOFTWARE</w:t>
+        <w:t>CURSO DE GRADUAÇÃO EM CIÊNCIA DA COMPUTAÇÃO</w:t>
       </w:r>
     </w:p>
     <w:p/>
@@ -184,7 +184,7 @@
           <w:rFonts w:ascii="Times New Roman" w:hAnsi="Times New Roman"/>
           <w:sz w:val="20"/>
         </w:rPr>
-        <w:t>Trabalho apresentado como requisito parcial à conclusão da disciplina de Estrutura de Dados, do Curso de Engenharia de Software do Centro Universitário de Maceió — UNIMA.</w:t>
+        <w:t>Trabalho apresentado como requisito parcial à conclusão da disciplina de Estrutura de Dados, do Curso de Ciência da Computação do Centro Universitário de Maceió — UNIMA.</w:t>
       </w:r>
     </w:p>
     <w:p/>

</xml_diff>